<commit_message>
Final Upload of Docurment
</commit_message>
<xml_diff>
--- a/module-5/Donohue-M5-Assignment-5_2.docx
+++ b/module-5/Donohue-M5-Assignment-5_2.docx
@@ -726,33 +726,13 @@
         <w:lastRenderedPageBreak/>
         <w:t>Flowchart for “forestfiresim.py” (</w:t>
       </w:r>
-      <w:proofErr w:type="spellStart"/>
-      <w:proofErr w:type="gramStart"/>
-      <w:r>
-        <w:rPr>
-          <w:rFonts w:ascii="Times New Roman" w:hAnsi="Times New Roman" w:cs="Times New Roman"/>
-          <w:sz w:val="24"/>
-          <w:szCs w:val="24"/>
-        </w:rPr>
-        <w:t>createNewForest</w:t>
-      </w:r>
-      <w:proofErr w:type="spellEnd"/>
-      <w:r>
-        <w:rPr>
-          <w:rFonts w:ascii="Times New Roman" w:hAnsi="Times New Roman" w:cs="Times New Roman"/>
-          <w:sz w:val="24"/>
-          <w:szCs w:val="24"/>
-        </w:rPr>
-        <w:t>(</w:t>
-      </w:r>
-      <w:proofErr w:type="gramEnd"/>
-      <w:r>
-        <w:rPr>
-          <w:rFonts w:ascii="Times New Roman" w:hAnsi="Times New Roman" w:cs="Times New Roman"/>
-          <w:sz w:val="24"/>
-          <w:szCs w:val="24"/>
-        </w:rPr>
-        <w:t>)</w:t>
+      <w:r>
+        <w:rPr>
+          <w:rFonts w:ascii="Times New Roman" w:hAnsi="Times New Roman" w:cs="Times New Roman"/>
+          <w:sz w:val="24"/>
+          <w:szCs w:val="24"/>
+        </w:rPr>
+        <w:t>createNewForest()</w:t>
       </w:r>
       <w:r>
         <w:rPr>
@@ -840,25 +820,7 @@
           <w:szCs w:val="24"/>
         </w:rPr>
         <w:lastRenderedPageBreak/>
-        <w:t>Flowchart for “forestfiresim.py” (</w:t>
-      </w:r>
-      <w:proofErr w:type="spellStart"/>
-      <w:r>
-        <w:rPr>
-          <w:rFonts w:ascii="Times New Roman" w:hAnsi="Times New Roman" w:cs="Times New Roman"/>
-          <w:sz w:val="24"/>
-          <w:szCs w:val="24"/>
-        </w:rPr>
-        <w:t>displayForest</w:t>
-      </w:r>
-      <w:proofErr w:type="spellEnd"/>
-      <w:r>
-        <w:rPr>
-          <w:rFonts w:ascii="Times New Roman" w:hAnsi="Times New Roman" w:cs="Times New Roman"/>
-          <w:sz w:val="24"/>
-          <w:szCs w:val="24"/>
-        </w:rPr>
-        <w:t>(forest))</w:t>
+        <w:t>Flowchart for “forestfiresim.py” (displayForest(forest))</w:t>
       </w:r>
     </w:p>
     <w:p>
@@ -933,17 +895,49 @@
     <w:p/>
     <w:p/>
     <w:p>
-      <w:proofErr w:type="spellStart"/>
       <w:r>
         <w:lastRenderedPageBreak/>
-        <w:t>Github</w:t>
-      </w:r>
-      <w:proofErr w:type="spellEnd"/>
-      <w:r>
-        <w:t xml:space="preserve"> Upload</w:t>
+        <w:t>Github Upload</w:t>
       </w:r>
       <w:r>
         <w:br/>
+      </w:r>
+      <w:r>
+        <w:drawing>
+          <wp:inline distT="0" distB="0" distL="0" distR="0" wp14:anchorId="7F7B6189" wp14:editId="2DDA4EEA">
+            <wp:extent cx="5943600" cy="3756660"/>
+            <wp:effectExtent l="0" t="0" r="0" b="0"/>
+            <wp:docPr id="334112075" name="Picture 1"/>
+            <wp:cNvGraphicFramePr>
+              <a:graphicFrameLocks xmlns:a="http://schemas.openxmlformats.org/drawingml/2006/main" noChangeAspect="1"/>
+            </wp:cNvGraphicFramePr>
+            <a:graphic xmlns:a="http://schemas.openxmlformats.org/drawingml/2006/main">
+              <a:graphicData uri="http://schemas.openxmlformats.org/drawingml/2006/picture">
+                <pic:pic xmlns:pic="http://schemas.openxmlformats.org/drawingml/2006/picture">
+                  <pic:nvPicPr>
+                    <pic:cNvPr id="334112075" name=""/>
+                    <pic:cNvPicPr/>
+                  </pic:nvPicPr>
+                  <pic:blipFill>
+                    <a:blip r:embed="rId12"/>
+                    <a:stretch>
+                      <a:fillRect/>
+                    </a:stretch>
+                  </pic:blipFill>
+                  <pic:spPr>
+                    <a:xfrm>
+                      <a:off x="0" y="0"/>
+                      <a:ext cx="5943600" cy="3756660"/>
+                    </a:xfrm>
+                    <a:prstGeom prst="rect">
+                      <a:avLst/>
+                    </a:prstGeom>
+                  </pic:spPr>
+                </pic:pic>
+              </a:graphicData>
+            </a:graphic>
+          </wp:inline>
+        </w:drawing>
       </w:r>
     </w:p>
     <w:p>
@@ -977,7 +971,6 @@
         </w:rPr>
         <w:t xml:space="preserve">Lucid Software. (2025). </w:t>
       </w:r>
-      <w:proofErr w:type="spellStart"/>
       <w:r>
         <w:rPr>
           <w:rFonts w:ascii="Times New Roman" w:hAnsi="Times New Roman" w:cs="Times New Roman"/>
@@ -988,7 +981,6 @@
         </w:rPr>
         <w:t>Lucidchart</w:t>
       </w:r>
-      <w:proofErr w:type="spellEnd"/>
       <w:r>
         <w:rPr>
           <w:rFonts w:ascii="Times New Roman" w:hAnsi="Times New Roman" w:cs="Times New Roman"/>
@@ -997,7 +989,7 @@
         </w:rPr>
         <w:t xml:space="preserve"> [Web-based diagramming tool]. </w:t>
       </w:r>
-      <w:hyperlink r:id="rId12" w:history="1">
+      <w:hyperlink r:id="rId13" w:history="1">
         <w:r>
           <w:rPr>
             <w:rStyle w:val="Hyperlink"/>
@@ -1016,10 +1008,10 @@
       </w:pPr>
     </w:p>
     <w:sectPr>
-      <w:headerReference w:type="default" r:id="rId13"/>
-      <w:footerReference w:type="default" r:id="rId14"/>
-      <w:headerReference w:type="first" r:id="rId15"/>
-      <w:footerReference w:type="first" r:id="rId16"/>
+      <w:headerReference w:type="default" r:id="rId14"/>
+      <w:footerReference w:type="default" r:id="rId15"/>
+      <w:headerReference w:type="first" r:id="rId16"/>
+      <w:footerReference w:type="first" r:id="rId17"/>
       <w:type w:val="continuous"/>
       <w:pgSz w:w="12240" w:h="15840" w:code="1"/>
       <w:pgMar w:top="1440" w:right="1440" w:bottom="1440" w:left="1440" w:header="720" w:footer="720" w:gutter="0"/>

</xml_diff>